<commit_message>
README end notes reformat
</commit_message>
<xml_diff>
--- a/docs/Короткие_инструкции/docx/A1_Развёртывание_репозитория_с_ПО_для_jetbot_mirea.docx
+++ b/docs/Короткие_инструкции/docx/A1_Развёртывание_репозитория_с_ПО_для_jetbot_mirea.docx
@@ -199,6 +199,23 @@
     </w:p>
     <w:p>
       <w:pPr>
+        <w:pStyle w:val="3"/>
+        <w:bidi w:val="0"/>
+        <w:rPr>
+          <w:rFonts w:hint="default"/>
+          <w:lang w:val="ru-RU"/>
+        </w:rPr>
+      </w:pPr>
+      <w:r>
+        <w:rPr>
+          <w:rFonts w:hint="default"/>
+          <w:lang w:val="ru-RU"/>
+        </w:rPr>
+        <w:t>Пошаговая инструкция</w:t>
+      </w:r>
+    </w:p>
+    <w:p>
+      <w:pPr>
         <w:jc w:val="both"/>
         <w:rPr>
           <w:rFonts w:hint="default"/>
@@ -344,7 +361,7 @@
           <w:vertAlign w:val="baseline"/>
           <w:lang w:val="ru-RU"/>
         </w:rPr>
-        <w:t>Скопируйте репозиторий.</w:t>
+        <w:t>Склонируйте репозиторий.</w:t>
       </w:r>
     </w:p>
     <w:p>
@@ -433,7 +450,25 @@
           <w:vertAlign w:val="baseline"/>
           <w:lang w:val="en-US"/>
         </w:rPr>
-        <w:t xml:space="preserve">Обратите внимание на точку в конце – она означает, что содержимое репозитория скопируется сразу в текущую папку </w:t>
+        <w:t xml:space="preserve">Обратите внимание на </w:t>
+      </w:r>
+      <w:r>
+        <w:rPr>
+          <w:rFonts w:hint="default"/>
+          <w:b/>
+          <w:bCs/>
+          <w:vertAlign w:val="baseline"/>
+          <w:lang w:val="en-US"/>
+        </w:rPr>
+        <w:t xml:space="preserve">точку </w:t>
+      </w:r>
+      <w:r>
+        <w:rPr>
+          <w:rFonts w:hint="default"/>
+          <w:vertAlign w:val="baseline"/>
+          <w:lang w:val="en-US"/>
+        </w:rPr>
+        <w:t xml:space="preserve">в конце – она означает, что содержимое репозитория скопируется сразу в текущую папку </w:t>
       </w:r>
       <w:r>
         <w:rPr>
@@ -489,7 +524,47 @@
           <w:vertAlign w:val="baseline"/>
           <w:lang w:val="ru-RU"/>
         </w:rPr>
-        <w:t xml:space="preserve">Установите зависимости следующей командой. </w:t>
+        <w:t xml:space="preserve">Установка зависимостей. </w:t>
+      </w:r>
+    </w:p>
+    <w:p>
+      <w:pPr>
+        <w:numPr>
+          <w:ilvl w:val="0"/>
+          <w:numId w:val="0"/>
+        </w:numPr>
+        <w:ind w:left="70" w:leftChars="0" w:firstLine="719" w:firstLineChars="0"/>
+        <w:jc w:val="both"/>
+        <w:rPr>
+          <w:rFonts w:hint="default"/>
+          <w:vertAlign w:val="baseline"/>
+          <w:lang w:val="ru-RU"/>
+        </w:rPr>
+      </w:pPr>
+      <w:r>
+        <w:rPr>
+          <w:rFonts w:hint="default"/>
+          <w:vertAlign w:val="baseline"/>
+          <w:lang w:val="ru-RU"/>
+        </w:rPr>
+        <w:t>Перейдите в папку со скриптами инициализации:</w:t>
+      </w:r>
+    </w:p>
+    <w:p>
+      <w:pPr>
+        <w:pStyle w:val="20"/>
+        <w:bidi w:val="0"/>
+        <w:rPr>
+          <w:rFonts w:hint="default"/>
+          <w:lang w:val="en-US"/>
+        </w:rPr>
+      </w:pPr>
+      <w:r>
+        <w:rPr>
+          <w:rFonts w:hint="default"/>
+          <w:lang w:val="en-US"/>
+        </w:rPr>
+        <w:t>cd init_scripts</w:t>
       </w:r>
     </w:p>
     <w:p>
@@ -502,60 +577,77 @@
         <w:jc w:val="both"/>
         <w:rPr>
           <w:rFonts w:hint="default"/>
-          <w:vertAlign w:val="baseline"/>
-          <w:lang w:val="en-US"/>
-        </w:rPr>
-      </w:pPr>
-      <w:r>
-        <w:rPr>
-          <w:rFonts w:hint="default"/>
           <w:b/>
           <w:bCs/>
           <w:vertAlign w:val="baseline"/>
           <w:lang w:val="ru-RU"/>
         </w:rPr>
-        <w:t>Важно:</w:t>
-      </w:r>
-      <w:r>
-        <w:rPr>
-          <w:rFonts w:hint="default"/>
-          <w:vertAlign w:val="baseline"/>
-          <w:lang w:val="ru-RU"/>
-        </w:rPr>
-        <w:t xml:space="preserve"> Следите за выводом скрипта, если будут ошибки при установке и скачаются не все пакеты,</w:t>
-      </w:r>
-      <w:r>
-        <w:rPr>
-          <w:rFonts w:hint="default"/>
-          <w:vertAlign w:val="baseline"/>
-          <w:lang w:val="en-US"/>
-        </w:rPr>
-        <w:t xml:space="preserve"> </w:t>
-      </w:r>
-      <w:r>
-        <w:rPr>
-          <w:rFonts w:hint="default"/>
-          <w:vertAlign w:val="baseline"/>
-          <w:lang w:val="ru-RU"/>
-        </w:rPr>
-        <w:t>и команда из п.4 для сборки пакета не сработает корректно. В выводе обычно написано как исправить ошибку и какие пакеты смогли установиться корректно, а какие нет, и почему.</w:t>
-      </w:r>
-    </w:p>
-    <w:p>
-      <w:pPr>
-        <w:pStyle w:val="20"/>
-        <w:bidi w:val="0"/>
-        <w:rPr>
-          <w:rFonts w:hint="default"/>
-          <w:lang w:val="en-US"/>
-        </w:rPr>
-      </w:pPr>
-      <w:r>
-        <w:rPr>
-          <w:rFonts w:hint="default"/>
-          <w:lang w:val="en-US"/>
-        </w:rPr>
-        <w:t>sudo bash init_scripts/install_deps.bash</w:t>
+      </w:pPr>
+    </w:p>
+    <w:p>
+      <w:pPr>
+        <w:numPr>
+          <w:ilvl w:val="0"/>
+          <w:numId w:val="0"/>
+        </w:numPr>
+        <w:ind w:left="70" w:leftChars="0" w:firstLine="719" w:firstLineChars="0"/>
+        <w:jc w:val="both"/>
+        <w:rPr>
+          <w:rFonts w:hint="default"/>
+          <w:b w:val="0"/>
+          <w:bCs w:val="0"/>
+          <w:vertAlign w:val="baseline"/>
+          <w:lang w:val="ru-RU"/>
+        </w:rPr>
+      </w:pPr>
+      <w:bookmarkStart w:id="1" w:name="_GoBack"/>
+      <w:bookmarkEnd w:id="1"/>
+      <w:r>
+        <w:rPr>
+          <w:rFonts w:hint="default"/>
+          <w:b w:val="0"/>
+          <w:bCs w:val="0"/>
+          <w:vertAlign w:val="baseline"/>
+          <w:lang w:val="ru-RU"/>
+        </w:rPr>
+        <w:t>Теперь в зависимости от того, где вы разворачиваете рабочее пространство, выберите подходящий скрипт:</w:t>
+      </w:r>
+    </w:p>
+    <w:p>
+      <w:pPr>
+        <w:numPr>
+          <w:ilvl w:val="0"/>
+          <w:numId w:val="3"/>
+        </w:numPr>
+        <w:ind w:left="420" w:leftChars="0" w:hanging="420" w:firstLineChars="0"/>
+        <w:jc w:val="both"/>
+        <w:rPr>
+          <w:rFonts w:hint="default"/>
+          <w:b w:val="0"/>
+          <w:bCs w:val="0"/>
+          <w:vertAlign w:val="baseline"/>
+          <w:lang w:val="ru-RU"/>
+        </w:rPr>
+      </w:pPr>
+      <w:r>
+        <w:rPr>
+          <w:rFonts w:hint="default"/>
+          <w:b/>
+          <w:bCs/>
+          <w:vertAlign w:val="baseline"/>
+          <w:lang w:val="ru-RU"/>
+        </w:rPr>
+        <w:t>Если вы на реальном роботе (Jetson Nano):</w:t>
+      </w:r>
+      <w:r>
+        <w:rPr>
+          <w:rFonts w:hint="default"/>
+          <w:b w:val="0"/>
+          <w:bCs w:val="0"/>
+          <w:vertAlign w:val="baseline"/>
+          <w:lang w:val="ru-RU"/>
+        </w:rPr>
+        <w:t xml:space="preserve"> здесь не нужна симуляция Gazebo, поэтому используйте скрипт для робота.</w:t>
       </w:r>
     </w:p>
     <w:p>
@@ -568,6 +660,227 @@
         <w:jc w:val="both"/>
         <w:rPr>
           <w:rFonts w:hint="default"/>
+          <w:b w:val="0"/>
+          <w:bCs w:val="0"/>
+          <w:vertAlign w:val="baseline"/>
+          <w:lang w:val="ru-RU"/>
+        </w:rPr>
+      </w:pPr>
+    </w:p>
+    <w:p>
+      <w:pPr>
+        <w:pStyle w:val="20"/>
+        <w:bidi w:val="0"/>
+        <w:rPr>
+          <w:rFonts w:hint="default"/>
+          <w:lang w:val="ru-RU"/>
+        </w:rPr>
+      </w:pPr>
+      <w:r>
+        <w:rPr>
+          <w:rFonts w:hint="default"/>
+          <w:lang w:val="ru-RU"/>
+        </w:rPr>
+        <w:t>chmod +x install_dependensies_jetbot.bash</w:t>
+      </w:r>
+    </w:p>
+    <w:p>
+      <w:pPr>
+        <w:pStyle w:val="20"/>
+        <w:bidi w:val="0"/>
+        <w:rPr>
+          <w:rFonts w:hint="default"/>
+          <w:lang w:val="ru-RU"/>
+        </w:rPr>
+      </w:pPr>
+      <w:r>
+        <w:rPr>
+          <w:rFonts w:hint="default"/>
+          <w:lang w:val="ru-RU"/>
+        </w:rPr>
+        <w:t>./install_dependensies_jetbot.bash   # Во время установки будет запрошен пароль sudo</w:t>
+      </w:r>
+    </w:p>
+    <w:p>
+      <w:pPr>
+        <w:numPr>
+          <w:ilvl w:val="0"/>
+          <w:numId w:val="0"/>
+        </w:numPr>
+        <w:ind w:left="70" w:leftChars="0"/>
+        <w:jc w:val="both"/>
+        <w:rPr>
+          <w:rFonts w:hint="default"/>
+          <w:b w:val="0"/>
+          <w:bCs w:val="0"/>
+          <w:vertAlign w:val="baseline"/>
+          <w:lang w:val="ru-RU"/>
+        </w:rPr>
+      </w:pPr>
+    </w:p>
+    <w:p>
+      <w:pPr>
+        <w:numPr>
+          <w:ilvl w:val="0"/>
+          <w:numId w:val="3"/>
+        </w:numPr>
+        <w:ind w:left="420" w:leftChars="0" w:hanging="420" w:firstLineChars="0"/>
+        <w:jc w:val="both"/>
+        <w:rPr>
+          <w:rFonts w:hint="default"/>
+          <w:b w:val="0"/>
+          <w:bCs w:val="0"/>
+          <w:vertAlign w:val="baseline"/>
+          <w:lang w:val="ru-RU"/>
+        </w:rPr>
+      </w:pPr>
+      <w:r>
+        <w:rPr>
+          <w:rFonts w:hint="default"/>
+          <w:b/>
+          <w:bCs/>
+          <w:vertAlign w:val="baseline"/>
+          <w:lang w:val="ru-RU"/>
+        </w:rPr>
+        <w:t>Если вы на компьютере-хосте:</w:t>
+      </w:r>
+      <w:r>
+        <w:rPr>
+          <w:rFonts w:hint="default"/>
+          <w:b w:val="0"/>
+          <w:bCs w:val="0"/>
+          <w:vertAlign w:val="baseline"/>
+          <w:lang w:val="ru-RU"/>
+        </w:rPr>
+        <w:t xml:space="preserve"> нужен полный набор зависимостей.</w:t>
+      </w:r>
+    </w:p>
+    <w:p>
+      <w:pPr>
+        <w:numPr>
+          <w:ilvl w:val="0"/>
+          <w:numId w:val="0"/>
+        </w:numPr>
+        <w:ind w:left="70" w:leftChars="0"/>
+        <w:jc w:val="both"/>
+        <w:rPr>
+          <w:rFonts w:hint="default"/>
+          <w:b w:val="0"/>
+          <w:bCs w:val="0"/>
+          <w:vertAlign w:val="baseline"/>
+          <w:lang w:val="ru-RU"/>
+        </w:rPr>
+      </w:pPr>
+    </w:p>
+    <w:p>
+      <w:pPr>
+        <w:pStyle w:val="20"/>
+        <w:bidi w:val="0"/>
+        <w:rPr>
+          <w:rFonts w:hint="default"/>
+          <w:lang w:val="ru-RU"/>
+        </w:rPr>
+      </w:pPr>
+      <w:r>
+        <w:rPr>
+          <w:rFonts w:hint="default"/>
+          <w:lang w:val="ru-RU"/>
+        </w:rPr>
+        <w:t>chmod +x install_dependensies_host.bash</w:t>
+      </w:r>
+    </w:p>
+    <w:p>
+      <w:pPr>
+        <w:pStyle w:val="20"/>
+        <w:bidi w:val="0"/>
+        <w:rPr>
+          <w:rFonts w:hint="default"/>
+          <w:lang w:val="ru-RU"/>
+        </w:rPr>
+      </w:pPr>
+      <w:r>
+        <w:rPr>
+          <w:rFonts w:hint="default"/>
+          <w:lang w:val="ru-RU"/>
+        </w:rPr>
+        <w:t>./install_dependensies_host.bash     # Во время установки будет запрошен пароль sudo</w:t>
+      </w:r>
+    </w:p>
+    <w:p>
+      <w:pPr>
+        <w:numPr>
+          <w:ilvl w:val="0"/>
+          <w:numId w:val="0"/>
+        </w:numPr>
+        <w:jc w:val="both"/>
+        <w:rPr>
+          <w:rFonts w:hint="default"/>
+          <w:b/>
+          <w:bCs/>
+          <w:vertAlign w:val="baseline"/>
+          <w:lang w:val="ru-RU"/>
+        </w:rPr>
+      </w:pPr>
+    </w:p>
+    <w:p>
+      <w:pPr>
+        <w:numPr>
+          <w:ilvl w:val="0"/>
+          <w:numId w:val="0"/>
+        </w:numPr>
+        <w:ind w:left="70" w:leftChars="0"/>
+        <w:jc w:val="both"/>
+        <w:rPr>
+          <w:rFonts w:hint="default"/>
+          <w:vertAlign w:val="baseline"/>
+          <w:lang w:val="en-US"/>
+        </w:rPr>
+      </w:pPr>
+      <w:r>
+        <w:rPr>
+          <w:rFonts w:hint="default"/>
+          <w:b/>
+          <w:bCs/>
+          <w:vertAlign w:val="baseline"/>
+          <w:lang w:val="ru-RU"/>
+        </w:rPr>
+        <w:t>Важно:</w:t>
+      </w:r>
+      <w:r>
+        <w:rPr>
+          <w:rFonts w:hint="default"/>
+          <w:vertAlign w:val="baseline"/>
+          <w:lang w:val="ru-RU"/>
+        </w:rPr>
+        <w:t xml:space="preserve"> Следите за выводом скрипта, если будут ошибки при установке и скачаются не все пакеты,</w:t>
+      </w:r>
+      <w:r>
+        <w:rPr>
+          <w:rFonts w:hint="default"/>
+          <w:vertAlign w:val="baseline"/>
+          <w:lang w:val="en-US"/>
+        </w:rPr>
+        <w:t xml:space="preserve"> </w:t>
+      </w:r>
+      <w:r>
+        <w:rPr>
+          <w:rFonts w:hint="default"/>
+          <w:vertAlign w:val="baseline"/>
+          <w:lang w:val="ru-RU"/>
+        </w:rPr>
+        <w:t>и команда из п.4 для сборки пакета не сработает корректно. В выводе обычно написано как исправить ошибку и какие пакеты смогли установиться корректно, а какие нет, и почему.</w:t>
+      </w:r>
+    </w:p>
+    <w:p>
+      <w:pPr>
+        <w:numPr>
+          <w:ilvl w:val="0"/>
+          <w:numId w:val="0"/>
+        </w:numPr>
+        <w:ind w:left="70" w:leftChars="0"/>
+        <w:jc w:val="both"/>
+        <w:rPr>
+          <w:rFonts w:hint="default"/>
           <w:vertAlign w:val="baseline"/>
           <w:lang w:val="en-US"/>
         </w:rPr>
@@ -593,7 +906,49 @@
           <w:vertAlign w:val="baseline"/>
           <w:lang w:val="ru-RU"/>
         </w:rPr>
-        <w:t>Вернитесь в корень рабочего пространства и выполните сборку.</w:t>
+        <w:t>Сборка рабочего пространства</w:t>
+      </w:r>
+      <w:r>
+        <w:rPr>
+          <w:rFonts w:hint="default"/>
+          <w:vertAlign w:val="baseline"/>
+          <w:lang w:val="en-US"/>
+        </w:rPr>
+        <w:t xml:space="preserve"> (</w:t>
+      </w:r>
+      <w:r>
+        <w:rPr>
+          <w:rFonts w:hint="default"/>
+          <w:vertAlign w:val="baseline"/>
+          <w:lang w:val="ru-RU"/>
+        </w:rPr>
+        <w:t xml:space="preserve">туда, где лежит папка </w:t>
+      </w:r>
+      <w:r>
+        <w:rPr>
+          <w:rFonts w:hint="default"/>
+          <w:i/>
+          <w:iCs/>
+          <w:vertAlign w:val="baseline"/>
+          <w:lang w:val="en-US"/>
+        </w:rPr>
+        <w:t>src/</w:t>
+      </w:r>
+      <w:r>
+        <w:rPr>
+          <w:rFonts w:hint="default"/>
+          <w:vertAlign w:val="baseline"/>
+          <w:lang w:val="en-US"/>
+        </w:rPr>
+        <w:t>)</w:t>
+      </w:r>
+      <w:r>
+        <w:rPr>
+          <w:rFonts w:hint="default"/>
+          <w:vertAlign w:val="baseline"/>
+          <w:lang w:val="ru-RU"/>
+        </w:rPr>
+        <w:t>. Вернитесь в корень рабочего пространства и выполните сборку.</w:t>
       </w:r>
       <w:r>
         <w:rPr>
@@ -674,7 +1029,7 @@
           <w:rFonts w:hint="default"/>
           <w:lang w:val="en-US"/>
         </w:rPr>
-        <w:t>cd ..</w:t>
+        <w:t>cd ../..</w:t>
       </w:r>
     </w:p>
     <w:p>
@@ -876,6 +1231,29 @@
           <w:vertAlign w:val="baseline"/>
           <w:lang w:val="ru-RU"/>
         </w:rPr>
+        <w:t>Автоматическая подгрузка рабочего пространства.</w:t>
+      </w:r>
+    </w:p>
+    <w:p>
+      <w:pPr>
+        <w:numPr>
+          <w:ilvl w:val="0"/>
+          <w:numId w:val="0"/>
+        </w:numPr>
+        <w:ind w:left="70" w:leftChars="0" w:firstLine="719" w:firstLineChars="0"/>
+        <w:jc w:val="both"/>
+        <w:rPr>
+          <w:rFonts w:hint="default"/>
+          <w:vertAlign w:val="baseline"/>
+          <w:lang w:val="ru-RU"/>
+        </w:rPr>
+      </w:pPr>
+      <w:r>
+        <w:rPr>
+          <w:rFonts w:hint="default"/>
+          <w:vertAlign w:val="baseline"/>
+          <w:lang w:val="ru-RU"/>
+        </w:rPr>
         <w:t>Добавьте рабочую область в авто-</w:t>
       </w:r>
       <w:r>
@@ -1047,7 +1425,7 @@
       <w:pPr>
         <w:numPr>
           <w:ilvl w:val="0"/>
-          <w:numId w:val="3"/>
+          <w:numId w:val="4"/>
         </w:numPr>
         <w:bidi w:val="0"/>
         <w:ind w:left="420" w:leftChars="0" w:hanging="420" w:firstLineChars="0"/>
@@ -1070,14 +1448,28 @@
           <w:rFonts w:hint="default"/>
           <w:lang w:val="ru-RU"/>
         </w:rPr>
-        <w:t xml:space="preserve"> Загрузка прошивки (0_Загрузка_на_ESP32_прошивки.docx)</w:t>
+        <w:t xml:space="preserve"> Загрузка прошивки (0_Загрузка_на_ESP32_прошивки.</w:t>
+      </w:r>
+      <w:r>
+        <w:rPr>
+          <w:rFonts w:hint="default"/>
+          <w:lang w:val="en-US"/>
+        </w:rPr>
+        <w:t>pdf</w:t>
+      </w:r>
+      <w:r>
+        <w:rPr>
+          <w:rFonts w:hint="default"/>
+          <w:lang w:val="ru-RU"/>
+        </w:rPr>
+        <w:t>)</w:t>
       </w:r>
     </w:p>
     <w:p>
       <w:pPr>
         <w:numPr>
           <w:ilvl w:val="0"/>
-          <w:numId w:val="3"/>
+          <w:numId w:val="4"/>
         </w:numPr>
         <w:bidi w:val="0"/>
         <w:ind w:left="420" w:leftChars="0" w:hanging="420" w:firstLineChars="0"/>
@@ -1100,7 +1492,21 @@
           <w:rFonts w:hint="default"/>
           <w:lang w:val="ru-RU"/>
         </w:rPr>
-        <w:t>Создание симлинка (1_Создание_симлинка_для_ESP32.docx)</w:t>
+        <w:t>Создание симлинка (1_Создание_симлинка_для_ESP32.</w:t>
+      </w:r>
+      <w:r>
+        <w:rPr>
+          <w:rFonts w:hint="default"/>
+          <w:lang w:val="en-US"/>
+        </w:rPr>
+        <w:t>pdf</w:t>
+      </w:r>
+      <w:r>
+        <w:rPr>
+          <w:rFonts w:hint="default"/>
+          <w:lang w:val="ru-RU"/>
+        </w:rPr>
+        <w:t>)</w:t>
       </w:r>
     </w:p>
     <w:p>
@@ -1136,7 +1542,7 @@
       <w:pPr>
         <w:numPr>
           <w:ilvl w:val="0"/>
-          <w:numId w:val="3"/>
+          <w:numId w:val="4"/>
         </w:numPr>
         <w:bidi w:val="0"/>
         <w:ind w:left="420" w:leftChars="0" w:hanging="420" w:firstLineChars="0"/>
@@ -1159,7 +1565,21 @@
           <w:rFonts w:hint="default"/>
           <w:lang w:val="ru-RU"/>
         </w:rPr>
-        <w:t xml:space="preserve"> Создание симлинка для RPLidar (описано в A3_Как_запустить_датчики_и_приводной_уровень_на_роботе_jetbot_mirea.docx)</w:t>
+        <w:t xml:space="preserve"> Создание симлинка для RPLidar (описано в A3_Как_запустить_датчики_и_приводной_уровень_на_роботе_jetbot_mirea.</w:t>
+      </w:r>
+      <w:r>
+        <w:rPr>
+          <w:rFonts w:hint="default"/>
+          <w:lang w:val="en-US"/>
+        </w:rPr>
+        <w:t>pdf</w:t>
+      </w:r>
+      <w:r>
+        <w:rPr>
+          <w:rFonts w:hint="default"/>
+          <w:lang w:val="ru-RU"/>
+        </w:rPr>
+        <w:t>)</w:t>
       </w:r>
     </w:p>
     <w:p>
@@ -1195,7 +1615,7 @@
       <w:pPr>
         <w:numPr>
           <w:ilvl w:val="0"/>
-          <w:numId w:val="3"/>
+          <w:numId w:val="4"/>
         </w:numPr>
         <w:bidi w:val="0"/>
         <w:ind w:left="420" w:leftChars="0" w:hanging="420" w:firstLineChars="0"/>
@@ -1232,7 +1652,21 @@
           <w:rFonts w:hint="default"/>
           <w:lang w:val="ru-RU"/>
         </w:rPr>
-        <w:t>1_Как_запустить_симуляцию.docx)</w:t>
+        <w:t>1_Как_запустить_симуляцию.</w:t>
+      </w:r>
+      <w:r>
+        <w:rPr>
+          <w:rFonts w:hint="default"/>
+          <w:lang w:val="en-US"/>
+        </w:rPr>
+        <w:t>pdf</w:t>
+      </w:r>
+      <w:r>
+        <w:rPr>
+          <w:rFonts w:hint="default"/>
+          <w:lang w:val="ru-RU"/>
+        </w:rPr>
+        <w:t>)</w:t>
       </w:r>
     </w:p>
     <w:p>
@@ -1268,7 +1702,7 @@
       <w:pPr>
         <w:numPr>
           <w:ilvl w:val="0"/>
-          <w:numId w:val="3"/>
+          <w:numId w:val="4"/>
         </w:numPr>
         <w:bidi w:val="0"/>
         <w:ind w:left="420" w:leftChars="0" w:hanging="420" w:firstLineChars="0"/>
@@ -1300,14 +1734,26 @@
         </w:rPr>
         <w:t>R1</w:t>
       </w:r>
-      <w:bookmarkStart w:id="1" w:name="_GoBack"/>
-      <w:bookmarkEnd w:id="1"/>
-      <w:r>
-        <w:rPr>
-          <w:rFonts w:hint="default"/>
-          <w:lang w:val="ru-RU"/>
-        </w:rPr>
-        <w:t>_Как_запустить_датчики_и_приводной_уровень_на_роботе_jetbot_mirea.docx)</w:t>
+      <w:r>
+        <w:rPr>
+          <w:rFonts w:hint="default"/>
+          <w:lang w:val="ru-RU"/>
+        </w:rPr>
+        <w:t>_Как_запустить_датчики_и_приводной_уровень_на_роботе_jetbot_mirea.</w:t>
+      </w:r>
+      <w:r>
+        <w:rPr>
+          <w:rFonts w:hint="default"/>
+          <w:lang w:val="en-US"/>
+        </w:rPr>
+        <w:t>pdf</w:t>
+      </w:r>
+      <w:r>
+        <w:rPr>
+          <w:rFonts w:hint="default"/>
+          <w:lang w:val="ru-RU"/>
+        </w:rPr>
+        <w:t>)</w:t>
       </w:r>
     </w:p>
     <w:p>
@@ -1968,6 +2414,28 @@
     </w:lvl>
   </w:abstractNum>
   <w:abstractNum w:abstractNumId="2">
+    <w:nsid w:val="FFF66199"/>
+    <w:multiLevelType w:val="singleLevel"/>
+    <w:tmpl w:val="FFF66199"/>
+    <w:lvl w:ilvl="0" w:tentative="0">
+      <w:start w:val="1"/>
+      <w:numFmt w:val="bullet"/>
+      <w:lvlText w:val=""/>
+      <w:lvlJc w:val="left"/>
+      <w:pPr>
+        <w:tabs>
+          <w:tab w:val="left" w:pos="420"/>
+        </w:tabs>
+        <w:ind w:left="420" w:leftChars="0" w:hanging="420" w:firstLineChars="0"/>
+      </w:pPr>
+      <w:rPr>
+        <w:rFonts w:hint="default" w:ascii="Wingdings" w:hAnsi="Wingdings"/>
+        <w:sz w:val="18"/>
+        <w:szCs w:val="18"/>
+      </w:rPr>
+    </w:lvl>
+  </w:abstractNum>
+  <w:abstractNum w:abstractNumId="3">
     <w:nsid w:val="3EF6D6A1"/>
     <w:multiLevelType w:val="singleLevel"/>
     <w:tmpl w:val="3EF6D6A1"/>
@@ -1986,9 +2454,12 @@
     <w:abstractNumId w:val="0"/>
   </w:num>
   <w:num w:numId="2">
+    <w:abstractNumId w:val="3"/>
+  </w:num>
+  <w:num w:numId="3">
     <w:abstractNumId w:val="2"/>
   </w:num>
-  <w:num w:numId="3">
+  <w:num w:numId="4">
     <w:abstractNumId w:val="1"/>
   </w:num>
 </w:numbering>

</xml_diff>